<commit_message>
Add bilingual AIGC film cases and refresh publications
</commit_message>
<xml_diff>
--- a/deliverables/resume/sun-yingjie-resume-brand-en.docx
+++ b/deliverables/resume/sun-yingjie-resume-brand-en.docx
@@ -566,7 +566,7 @@
           <w:color w:val="20221F"/>
           <w:sz w:val="22"/>
         </w:rPr>
-        <w:t>Codex, ChatGPT, ComfyUI, Midjourney; market and cultural context</w:t>
+        <w:t>Codex, ChatGPT, ComfyUI, Midjourney; market and cultural context; Image 2.5, Seedance 2.5</w:t>
       </w:r>
     </w:p>
     <w:p>
@@ -581,7 +581,7 @@
           <w:color w:val="20221F"/>
           <w:sz w:val="22"/>
         </w:rPr>
-        <w:t>Independent AI practice: character sheets, lighting studies and ink film connect visual constraints, prompts and human review with 3D and brand expression.</w:t>
+        <w:t>Independent AI practice: character sheets, lighting studies and an ink film, a Mini DV coffee vlog and an autumn single-take fashion film connect visual constraints, prompts and human review with 3D and brand expression.</w:t>
       </w:r>
     </w:p>
     <w:p>

</xml_diff>